<commit_message>
Remove project durations from site and documents
Co-Authored-By: Claude Opus 5.5 <noreply@anthropic.com>
</commit_message>
<xml_diff>
--- a/assets/docs/jeong-hajun-resume.docx
+++ b/assets/docs/jeong-hajun-resume.docx
@@ -4025,26 +4025,6 @@
               <w:t>2026.05</w:t>
             </w:r>
           </w:p>
-          <w:p>
-            <w:pPr>
-              <w:pStyle w:val="a9"/>
-              <w:wordWrap/>
-              <w:spacing w:line="252" w:lineRule="auto"/>
-              <w:jc w:val="center"/>
-              <w:rPr>
-                <w:rFonts w:asciiTheme="minorHAnsi" w:eastAsiaTheme="minorHAnsi" w:hAnsiTheme="minorHAnsi"/>
-                <w:lang w:eastAsia="ko-KR"/>
-              </w:rPr>
-            </w:pPr>
-            <w:r>
-              <w:rPr>
-                <w:rFonts w:asciiTheme="minorHAnsi" w:eastAsiaTheme="minorHAnsi" w:hAnsiTheme="minorHAnsi" w:hint="eastAsia"/>
-                <w:sz w:val="18"/>
-                <w:lang w:eastAsia="ko-KR"/>
-              </w:rPr>
-              <w:t xml:space="preserve">2주</w:t>
-            </w:r>
-          </w:p>
         </w:tc>
         <w:tc>
           <w:tcPr>
@@ -4266,26 +4246,6 @@
               <w:t xml:space="preserve">2026.05~06</w:t>
             </w:r>
           </w:p>
-          <w:p>
-            <w:pPr>
-              <w:pStyle w:val="a9"/>
-              <w:wordWrap/>
-              <w:spacing w:line="252" w:lineRule="auto"/>
-              <w:jc w:val="center"/>
-              <w:rPr>
-                <w:rFonts w:asciiTheme="minorHAnsi" w:eastAsiaTheme="minorHAnsi" w:hAnsiTheme="minorHAnsi"/>
-                <w:lang w:eastAsia="ko-KR"/>
-              </w:rPr>
-            </w:pPr>
-            <w:r>
-              <w:rPr>
-                <w:rFonts w:asciiTheme="minorHAnsi" w:eastAsiaTheme="minorHAnsi" w:hAnsiTheme="minorHAnsi" w:hint="eastAsia"/>
-                <w:sz w:val="18"/>
-                <w:lang w:eastAsia="ko-KR"/>
-              </w:rPr>
-              <w:t xml:space="preserve">2주</w:t>
-            </w:r>
-          </w:p>
         </w:tc>
         <w:tc>
           <w:tcPr>
@@ -4508,25 +4468,6 @@
               <w:t>2026.07~08</w:t>
             </w:r>
           </w:p>
-          <w:p>
-            <w:pPr>
-              <w:pStyle w:val="a9"/>
-              <w:wordWrap/>
-              <w:spacing w:line="252" w:lineRule="auto"/>
-              <w:jc w:val="center"/>
-              <w:rPr>
-                <w:rFonts w:asciiTheme="minorHAnsi" w:eastAsiaTheme="minorHAnsi" w:hAnsiTheme="minorHAnsi"/>
-                <w:lang w:eastAsia="ko-KR"/>
-              </w:rPr>
-            </w:pPr>
-            <w:r>
-              <w:rPr>
-                <w:rFonts w:asciiTheme="minorHAnsi" w:eastAsiaTheme="minorHAnsi" w:hAnsiTheme="minorHAnsi"/>
-                <w:sz w:val="18"/>
-              </w:rPr>
-              <w:t>2개월</w:t>
-            </w:r>
-          </w:p>
         </w:tc>
         <w:tc>
           <w:tcPr>
@@ -4745,25 +4686,6 @@
                 <w:sz w:val="18"/>
               </w:rPr>
               <w:t>2026.09</w:t>
-            </w:r>
-          </w:p>
-          <w:p>
-            <w:pPr>
-              <w:pStyle w:val="a9"/>
-              <w:wordWrap/>
-              <w:spacing w:line="252" w:lineRule="auto"/>
-              <w:jc w:val="center"/>
-              <w:rPr>
-                <w:rFonts w:asciiTheme="minorHAnsi" w:eastAsiaTheme="minorHAnsi" w:hAnsiTheme="minorHAnsi"/>
-                <w:lang w:eastAsia="ko-KR"/>
-              </w:rPr>
-            </w:pPr>
-            <w:r>
-              <w:rPr>
-                <w:rFonts w:asciiTheme="minorHAnsi" w:eastAsiaTheme="minorHAnsi" w:hAnsiTheme="minorHAnsi"/>
-                <w:sz w:val="18"/>
-              </w:rPr>
-              <w:t>1개월</w:t>
             </w:r>
           </w:p>
         </w:tc>

</xml_diff>

<commit_message>
Resume: link portfolio homepage instead of Google Drive
Co-Authored-By: Claude Opus 5.5 <noreply@anthropic.com>
</commit_message>
<xml_diff>
--- a/assets/docs/jeong-hajun-resume.docx
+++ b/assets/docs/jeong-hajun-resume.docx
@@ -1299,31 +1299,7 @@
                   <w:szCs w:val="16"/>
                   <w:lang w:eastAsia="ko-KR"/>
                 </w:rPr>
-                <w:t>https://</w:t>
-              </w:r>
-              <w:r>
-                <w:rPr>
-                  <w:rStyle w:val="a6"/>
-                  <w:rFonts w:asciiTheme="minorHAnsi" w:eastAsiaTheme="minorHAnsi" w:hAnsiTheme="minorHAnsi"/>
-                  <w:i/>
-                  <w:iCs/>
-                  <w:sz w:val="16"/>
-                  <w:szCs w:val="16"/>
-                  <w:lang w:eastAsia="ko-KR"/>
-                </w:rPr>
-                <w:t>d</w:t>
-              </w:r>
-              <w:r>
-                <w:rPr>
-                  <w:rStyle w:val="a6"/>
-                  <w:rFonts w:asciiTheme="minorHAnsi" w:eastAsiaTheme="minorHAnsi" w:hAnsiTheme="minorHAnsi"/>
-                  <w:i/>
-                  <w:iCs/>
-                  <w:sz w:val="16"/>
-                  <w:szCs w:val="16"/>
-                  <w:lang w:eastAsia="ko-KR"/>
-                </w:rPr>
-                <w:t>rive.google.com/drive/folders/1kTqOr1bDYY7X_OEUO_L3nHBBb859_hmc</w:t>
+                <w:t>https://hajun7944-prog.github.io</w:t>
               </w:r>
             </w:hyperlink>
             <w:r>

</xml_diff>